<commit_message>
Add CICIEC FPGA vision project
</commit_message>
<xml_diff>
--- a/assets/feng-kehan-resume.docx
+++ b/assets/feng-kehan-resume.docx
@@ -1,6 +1,6 @@
 
 <file path=word/document.xml><?xml version="1.0" encoding="utf-8"?>
-<w:document xmlns:wpc="http://schemas.microsoft.com/office/word/2010/wordprocessingCanvas" xmlns:mc="http://schemas.openxmlformats.org/markup-compatibility/2006" xmlns:o="urn:schemas-microsoft-com:office:office" xmlns:r="http://schemas.openxmlformats.org/officeDocument/2006/relationships" xmlns:m="http://schemas.openxmlformats.org/officeDocument/2006/math" xmlns:v="urn:schemas-microsoft-com:vml" xmlns:wp14="http://schemas.microsoft.com/office/word/2010/wordprocessingDrawing" xmlns:wp="http://schemas.openxmlformats.org/drawingml/2006/wordprocessingDrawing" xmlns:w="http://schemas.openxmlformats.org/wordprocessingml/2006/main" xmlns:w14="http://schemas.microsoft.com/office/word/2010/wordml" xmlns:w10="urn:schemas-microsoft-com:office:word" xmlns:w15="http://schemas.microsoft.com/office/word/2012/wordml" xmlns:wpg="http://schemas.microsoft.com/office/word/2010/wordprocessingGroup" xmlns:wpi="http://schemas.microsoft.com/office/word/2010/wordprocessingInk" xmlns:wne="http://schemas.microsoft.com/office/word/2006/wordml" xmlns:wps="http://schemas.microsoft.com/office/word/2010/wordprocessingShape" xmlns:wpsCustomData="http://www.wps.cn/officeDocument/2013/wpsCustomData" mc:Ignorable="w14 w15 wp14">
+<w:document xmlns:mc="http://schemas.openxmlformats.org/markup-compatibility/2006" xmlns:ns4="http://schemas.openxmlformats.org/drawingml/2006/main" xmlns:ns5="http://schemas.openxmlformats.org/drawingml/2006/picture" xmlns:r="http://schemas.openxmlformats.org/officeDocument/2006/relationships" xmlns:w="http://schemas.openxmlformats.org/wordprocessingml/2006/main" xmlns:w14="http://schemas.microsoft.com/office/word/2010/wordml" xmlns:wp="http://schemas.openxmlformats.org/drawingml/2006/wordprocessingDrawing" mc:Ignorable="w14 w15 wp14">
   <w:body>
     <w:p>
       <w:pPr>
@@ -29,35 +29,35 @@
             <wp:wrapNone/>
             <wp:docPr id="1" name="image1.jpeg" descr="穿西装的男人&#10;&#10;描述已自动生成"/>
             <wp:cNvGraphicFramePr>
-              <a:graphicFrameLocks xmlns:a="http://schemas.openxmlformats.org/drawingml/2006/main" noChangeAspect="1"/>
+              <ns4:graphicFrameLocks noChangeAspect="1"/>
             </wp:cNvGraphicFramePr>
-            <a:graphic xmlns:a="http://schemas.openxmlformats.org/drawingml/2006/main">
-              <a:graphicData uri="http://schemas.openxmlformats.org/drawingml/2006/picture">
-                <pic:pic xmlns:pic="http://schemas.openxmlformats.org/drawingml/2006/picture">
-                  <pic:nvPicPr>
-                    <pic:cNvPr id="1" name="image1.jpeg" descr="穿西装的男人&#10;&#10;描述已自动生成"/>
-                    <pic:cNvPicPr>
-                      <a:picLocks noChangeAspect="1"/>
-                    </pic:cNvPicPr>
-                  </pic:nvPicPr>
-                  <pic:blipFill>
-                    <a:blip r:embed="rId6" cstate="print"/>
-                    <a:stretch>
-                      <a:fillRect/>
-                    </a:stretch>
-                  </pic:blipFill>
-                  <pic:spPr>
-                    <a:xfrm>
-                      <a:off x="0" y="0"/>
-                      <a:ext cx="615950" cy="733031"/>
-                    </a:xfrm>
-                    <a:prstGeom prst="rect">
-                      <a:avLst/>
-                    </a:prstGeom>
-                  </pic:spPr>
-                </pic:pic>
-              </a:graphicData>
-            </a:graphic>
+            <ns4:graphic>
+              <ns4:graphicData uri="http://schemas.openxmlformats.org/drawingml/2006/picture">
+                <ns5:pic>
+                  <ns5:nvPicPr>
+                    <ns5:cNvPr id="1" name="image1.jpeg" descr="穿西装的男人&#10;&#10;描述已自动生成"/>
+                    <ns5:cNvPicPr>
+                      <ns4:picLocks noChangeAspect="1"/>
+                    </ns5:cNvPicPr>
+                  </ns5:nvPicPr>
+                  <ns5:blipFill>
+                    <ns4:blip r:embed="rId6" cstate="print"/>
+                    <ns4:stretch>
+                      <ns4:fillRect/>
+                    </ns4:stretch>
+                  </ns5:blipFill>
+                  <ns5:spPr>
+                    <ns4:xfrm>
+                      <ns4:off x="0" y="0"/>
+                      <ns4:ext cx="615950" cy="733031"/>
+                    </ns4:xfrm>
+                    <ns4:prstGeom prst="rect">
+                      <ns4:avLst/>
+                    </ns4:prstGeom>
+                  </ns5:spPr>
+                </ns5:pic>
+              </ns4:graphicData>
+            </ns4:graphic>
           </wp:anchor>
         </w:drawing>
       </w:r>
@@ -453,198 +453,6 @@
           <w:sz w:val="20"/>
           <w:szCs w:val="32"/>
         </w:rPr>
-        <w:t>FPGA-DIFF：高性能 ISA 级验证平台  2025.01 - 至今</w:t>
-      </w:r>
-    </w:p>
-    <w:p>
-      <w:r>
-        <w:rPr>
-          <w:color w:val="000000"/>
-          <w:sz w:val="20"/>
-          <w:szCs w:val="32"/>
-        </w:rPr>
-        <w:t>▸ 搭建 FPGA SOC 验证环境，将 Difftest 集成至 FPGA 工程，实现验证流程自动化 CI。</w:t>
-      </w:r>
-    </w:p>
-    <w:p>
-      <w:r>
-        <w:rPr>
-          <w:color w:val="000000"/>
-          <w:sz w:val="20"/>
-          <w:szCs w:val="32"/>
-        </w:rPr>
-        <w:t>▸ 设计 PCIe 高速上位机架构，实现 22GB/s 数据传输带宽，验证速度达 10M Cycle/s。</w:t>
-      </w:r>
-    </w:p>
-    <w:p>
-      <w:r>
-        <w:rPr>
-          <w:color w:val="000000"/>
-          <w:sz w:val="20"/>
-          <w:szCs w:val="32"/>
-        </w:rPr>
-        <w:t>▸ 相比 ZEBU 加速器提升 3 倍性能，成果投稿 2025 MICRO 顶会。</w:t>
-      </w:r>
-    </w:p>
-    <w:p>
-      <w:r>
-        <w:rPr>
-          <w:color w:val="000000"/>
-          <w:sz w:val="20"/>
-          <w:szCs w:val="32"/>
-        </w:rPr>
-        <w:t xml:space="preserve">▸ 优化 NEMU REF 模式性能，通过 tcache 结构优化、PMP/PMA 权限缓存与预解码、Host TLB 等热路径优化，将速度由约 </w:t>
-      </w:r>
-      <w:r>
-        <w:rPr>
-          <w:rFonts w:hint="eastAsia"/>
-          <w:color w:val="000000"/>
-          <w:sz w:val="20"/>
-          <w:szCs w:val="32"/>
-          <w:lang w:val="en-US" w:eastAsia="zh-CN"/>
-        </w:rPr>
-        <w:t>5</w:t>
-      </w:r>
-      <w:r>
-        <w:rPr>
-          <w:color w:val="000000"/>
-          <w:sz w:val="20"/>
-          <w:szCs w:val="32"/>
-        </w:rPr>
-        <w:t>M instr/s 提升至约 10M instr/s</w:t>
-      </w:r>
-      <w:r>
-        <w:rPr>
-          <w:rFonts w:hint="eastAsia"/>
-          <w:color w:val="000000"/>
-          <w:sz w:val="20"/>
-          <w:szCs w:val="32"/>
-          <w:lang w:eastAsia="zh-CN"/>
-        </w:rPr>
-        <w:t>，</w:t>
-      </w:r>
-      <w:r>
-        <w:rPr>
-          <w:rFonts w:hint="eastAsia"/>
-          <w:color w:val="000000"/>
-          <w:sz w:val="20"/>
-          <w:szCs w:val="32"/>
-          <w:lang w:val="en-US" w:eastAsia="zh-CN"/>
-        </w:rPr>
-        <w:t>关闭</w:t>
-      </w:r>
-      <w:r>
-        <w:rPr>
-          <w:rFonts w:hint="default"/>
-          <w:color w:val="000000"/>
-          <w:sz w:val="20"/>
-          <w:szCs w:val="32"/>
-          <w:lang w:val="en-US" w:eastAsia="zh-CN"/>
-        </w:rPr>
-        <w:t>PMP check</w:t>
-      </w:r>
-      <w:r>
-        <w:rPr>
-          <w:rFonts w:hint="eastAsia"/>
-          <w:color w:val="000000"/>
-          <w:sz w:val="20"/>
-          <w:szCs w:val="32"/>
-          <w:lang w:val="en-US" w:eastAsia="zh-CN"/>
-        </w:rPr>
-        <w:t>的情况下可达到 15M instr</w:t>
-      </w:r>
-      <w:r>
-        <w:rPr>
-          <w:rFonts w:hint="default"/>
-          <w:color w:val="000000"/>
-          <w:sz w:val="20"/>
-          <w:szCs w:val="32"/>
-          <w:lang w:val="en-US" w:eastAsia="zh-CN"/>
-        </w:rPr>
-        <w:t>/s</w:t>
-      </w:r>
-      <w:r>
-        <w:rPr>
-          <w:color w:val="000000"/>
-          <w:sz w:val="20"/>
-          <w:szCs w:val="32"/>
-        </w:rPr>
-        <w:t>。</w:t>
-      </w:r>
-    </w:p>
-    <w:p>
-      <w:pPr>
-        <w:pStyle w:val="9"/>
-      </w:pPr>
-      <w:r>
-        <w:rPr>
-          <w:color w:val="3498DB"/>
-          <w:sz w:val="20"/>
-          <w:szCs w:val="32"/>
-        </w:rPr>
-        <w:t>Celviz AI-Driven EDA：个人自研 Agent 芯片设计与验证工作台  2026.01 - 至今</w:t>
-      </w:r>
-    </w:p>
-    <w:p>
-      <w:r>
-        <w:rPr>
-          <w:color w:val="000000"/>
-          <w:sz w:val="20"/>
-          <w:szCs w:val="32"/>
-        </w:rPr>
-        <w:t>▸ 个人独立设计并实现 Celviz Agent 工作台，支持本地/远程 Web、Tauri 桌面端、无 GUI Shell 三类入口，统一工作区、运行记录与结果包管理。</w:t>
-      </w:r>
-    </w:p>
-    <w:p>
-      <w:r>
-        <w:rPr>
-          <w:color w:val="000000"/>
-          <w:sz w:val="20"/>
-          <w:szCs w:val="32"/>
-        </w:rPr>
-        <w:t>▸ 构建面向 EDA 工程的 Skill/知识库/RAG 体系，沉淀架构文档、项目索引、查询模板与工程经验，支持 AI 基于代码上下文完成任务。</w:t>
-      </w:r>
-    </w:p>
-    <w:p>
-      <w:r>
-        <w:rPr>
-          <w:color w:val="000000"/>
-          <w:sz w:val="20"/>
-          <w:szCs w:val="32"/>
-        </w:rPr>
-        <w:t>▸ 设计 EDA 工具链后端资产边界，将 aieda、parser、ieda、iflow、idata、source navigation 等模块纳入 services/oscc，形成可验证、可检索、可复用的工程资产。</w:t>
-      </w:r>
-    </w:p>
-    <w:p>
-      <w:r>
-        <w:rPr>
-          <w:color w:val="000000"/>
-          <w:sz w:val="20"/>
-          <w:szCs w:val="32"/>
-        </w:rPr>
-        <w:t>▸ 建设 Agent 协作开发与验证闭环，覆盖需求拆解、代码生成、代码审查、测试运行、validation log、evidence bundle、risk extraction 与 readiness report。</w:t>
-      </w:r>
-    </w:p>
-    <w:p>
-      <w:r>
-        <w:rPr>
-          <w:color w:val="000000"/>
-          <w:sz w:val="20"/>
-          <w:szCs w:val="32"/>
-        </w:rPr>
-        <w:t>▸ 面向 AI 自动架构探索与 RTL 验证，打通 SPEC 文档生成、架构模拟器反馈、Difftest/仿真验证任务编排，为后续自动 RTL 实现提供工程基础。</w:t>
-      </w:r>
-    </w:p>
-    <w:p>
-      <w:pPr>
-        <w:pStyle w:val="9"/>
-      </w:pPr>
-      <w:r>
-        <w:rPr>
-          <w:color w:val="3498DB"/>
-          <w:sz w:val="20"/>
-          <w:szCs w:val="32"/>
-        </w:rPr>
         <w:t>RISC-V RandomX：随机访存哈希 workload 的多核 RISC-V SoC 探索  2026.05 - 至今</w:t>
       </w:r>
     </w:p>
@@ -684,51 +492,6 @@
         </w:rPr>
         <w:t>▸ 建立可复现实验口径：8 核 compute cluster、16 memory endpoints、真实 FlooNoC RTL baseline，完成 SoC 级吞吐评估与多核数据通路验证。</w:t>
       </w:r>
-    </w:p>
-    <w:p>
-      <w:pPr>
-        <w:rPr>
-          <w:color w:val="000000"/>
-          <w:sz w:val="20"/>
-          <w:szCs w:val="32"/>
-        </w:rPr>
-      </w:pPr>
-    </w:p>
-    <w:p>
-      <w:pPr>
-        <w:rPr>
-          <w:color w:val="000000"/>
-          <w:sz w:val="20"/>
-          <w:szCs w:val="32"/>
-        </w:rPr>
-      </w:pPr>
-    </w:p>
-    <w:p>
-      <w:pPr>
-        <w:rPr>
-          <w:color w:val="000000"/>
-          <w:sz w:val="20"/>
-          <w:szCs w:val="32"/>
-        </w:rPr>
-      </w:pPr>
-    </w:p>
-    <w:p>
-      <w:pPr>
-        <w:rPr>
-          <w:color w:val="000000"/>
-          <w:sz w:val="20"/>
-          <w:szCs w:val="32"/>
-        </w:rPr>
-      </w:pPr>
-    </w:p>
-    <w:p>
-      <w:pPr>
-        <w:rPr>
-          <w:color w:val="000000"/>
-          <w:sz w:val="20"/>
-          <w:szCs w:val="32"/>
-        </w:rPr>
-      </w:pPr>
     </w:p>
     <w:p>
       <w:pPr>
@@ -821,6 +584,198 @@
           <w:sz w:val="20"/>
           <w:szCs w:val="32"/>
         </w:rPr>
+        <w:t>Celviz AI-Driven EDA：个人自研 Agent 芯片设计与验证工作台  2026.01 - 至今</w:t>
+      </w:r>
+    </w:p>
+    <w:p>
+      <w:r>
+        <w:rPr>
+          <w:color w:val="000000"/>
+          <w:sz w:val="20"/>
+          <w:szCs w:val="32"/>
+        </w:rPr>
+        <w:t>▸ 个人独立设计并实现 Celviz Agent 工作台，支持本地/远程 Web、Tauri 桌面端、无 GUI Shell 三类入口，统一工作区、运行记录与结果包管理。</w:t>
+      </w:r>
+    </w:p>
+    <w:p>
+      <w:r>
+        <w:rPr>
+          <w:color w:val="000000"/>
+          <w:sz w:val="20"/>
+          <w:szCs w:val="32"/>
+        </w:rPr>
+        <w:t>▸ 构建面向 EDA 工程的 Skill/知识库/RAG 体系，沉淀架构文档、项目索引、查询模板与工程经验，支持 AI 基于代码上下文完成任务。</w:t>
+      </w:r>
+    </w:p>
+    <w:p>
+      <w:r>
+        <w:rPr>
+          <w:color w:val="000000"/>
+          <w:sz w:val="20"/>
+          <w:szCs w:val="32"/>
+        </w:rPr>
+        <w:t>▸ 设计 EDA 工具链后端资产边界，将 aieda、parser、ieda、iflow、idata、source navigation 等模块纳入 services/oscc，形成可验证、可检索、可复用的工程资产。</w:t>
+      </w:r>
+    </w:p>
+    <w:p>
+      <w:r>
+        <w:rPr>
+          <w:color w:val="000000"/>
+          <w:sz w:val="20"/>
+          <w:szCs w:val="32"/>
+        </w:rPr>
+        <w:t>▸ 建设 Agent 协作开发与验证闭环，覆盖需求拆解、代码生成、代码审查、测试运行、validation log、evidence bundle、risk extraction 与 readiness report。</w:t>
+      </w:r>
+    </w:p>
+    <w:p>
+      <w:r>
+        <w:rPr>
+          <w:color w:val="000000"/>
+          <w:sz w:val="20"/>
+          <w:szCs w:val="32"/>
+        </w:rPr>
+        <w:t>▸ 面向 AI 自动架构探索与 RTL 验证，打通 SPEC 文档生成、架构模拟器反馈、Difftest/仿真验证任务编排，为后续自动 RTL 实现提供工程基础。</w:t>
+      </w:r>
+    </w:p>
+    <w:p>
+      <w:pPr>
+        <w:pStyle w:val="9"/>
+      </w:pPr>
+      <w:r>
+        <w:rPr>
+          <w:color w:val="3498DB"/>
+          <w:sz w:val="20"/>
+          <w:szCs w:val="32"/>
+        </w:rPr>
+        <w:t>FPGA-DIFF：高性能 ISA 级验证平台  2025.01 - 至今</w:t>
+      </w:r>
+    </w:p>
+    <w:p>
+      <w:r>
+        <w:rPr>
+          <w:color w:val="000000"/>
+          <w:sz w:val="20"/>
+          <w:szCs w:val="32"/>
+        </w:rPr>
+        <w:t>▸ 搭建 FPGA SOC 验证环境，将 Difftest 集成至 FPGA 工程，实现验证流程自动化 CI。</w:t>
+      </w:r>
+    </w:p>
+    <w:p>
+      <w:r>
+        <w:rPr>
+          <w:color w:val="000000"/>
+          <w:sz w:val="20"/>
+          <w:szCs w:val="32"/>
+        </w:rPr>
+        <w:t>▸ 设计 PCIe 高速上位机架构，实现 22GB/s 数据传输带宽，验证速度达 10M Cycle/s。</w:t>
+      </w:r>
+    </w:p>
+    <w:p>
+      <w:r>
+        <w:rPr>
+          <w:color w:val="000000"/>
+          <w:sz w:val="20"/>
+          <w:szCs w:val="32"/>
+        </w:rPr>
+        <w:t>▸ 相比 ZEBU 加速器提升 3 倍性能，成果投稿 2025 MICRO 顶会。</w:t>
+      </w:r>
+    </w:p>
+    <w:p>
+      <w:r>
+        <w:rPr>
+          <w:color w:val="000000"/>
+          <w:sz w:val="20"/>
+          <w:szCs w:val="32"/>
+        </w:rPr>
+        <w:t xml:space="preserve">▸ 优化 NEMU REF 模式性能，通过 tcache 结构优化、PMP/PMA 权限缓存与预解码、Host TLB 等热路径优化，将速度由约 </w:t>
+      </w:r>
+      <w:r>
+        <w:rPr>
+          <w:rFonts w:hint="eastAsia"/>
+          <w:color w:val="000000"/>
+          <w:sz w:val="20"/>
+          <w:szCs w:val="32"/>
+          <w:lang w:val="en-US" w:eastAsia="zh-CN"/>
+        </w:rPr>
+        <w:t>5</w:t>
+      </w:r>
+      <w:r>
+        <w:rPr>
+          <w:color w:val="000000"/>
+          <w:sz w:val="20"/>
+          <w:szCs w:val="32"/>
+        </w:rPr>
+        <w:t>M instr/s 提升至约 10M instr/s</w:t>
+      </w:r>
+      <w:r>
+        <w:rPr>
+          <w:rFonts w:hint="eastAsia"/>
+          <w:color w:val="000000"/>
+          <w:sz w:val="20"/>
+          <w:szCs w:val="32"/>
+          <w:lang w:eastAsia="zh-CN"/>
+        </w:rPr>
+        <w:t>，</w:t>
+      </w:r>
+      <w:r>
+        <w:rPr>
+          <w:rFonts w:hint="eastAsia"/>
+          <w:color w:val="000000"/>
+          <w:sz w:val="20"/>
+          <w:szCs w:val="32"/>
+          <w:lang w:val="en-US" w:eastAsia="zh-CN"/>
+        </w:rPr>
+        <w:t>关闭</w:t>
+      </w:r>
+      <w:r>
+        <w:rPr>
+          <w:rFonts w:hint="default"/>
+          <w:color w:val="000000"/>
+          <w:sz w:val="20"/>
+          <w:szCs w:val="32"/>
+          <w:lang w:val="en-US" w:eastAsia="zh-CN"/>
+        </w:rPr>
+        <w:t>PMP check</w:t>
+      </w:r>
+      <w:r>
+        <w:rPr>
+          <w:rFonts w:hint="eastAsia"/>
+          <w:color w:val="000000"/>
+          <w:sz w:val="20"/>
+          <w:szCs w:val="32"/>
+          <w:lang w:val="en-US" w:eastAsia="zh-CN"/>
+        </w:rPr>
+        <w:t>的情况下可达到 15M instr</w:t>
+      </w:r>
+      <w:r>
+        <w:rPr>
+          <w:rFonts w:hint="default"/>
+          <w:color w:val="000000"/>
+          <w:sz w:val="20"/>
+          <w:szCs w:val="32"/>
+          <w:lang w:val="en-US" w:eastAsia="zh-CN"/>
+        </w:rPr>
+        <w:t>/s</w:t>
+      </w:r>
+      <w:r>
+        <w:rPr>
+          <w:color w:val="000000"/>
+          <w:sz w:val="20"/>
+          <w:szCs w:val="32"/>
+        </w:rPr>
+        <w:t>。</w:t>
+      </w:r>
+    </w:p>
+    <w:p>
+      <w:pPr>
+        <w:pStyle w:val="9"/>
+      </w:pPr>
+      <w:r>
+        <w:rPr>
+          <w:color w:val="3498DB"/>
+          <w:sz w:val="20"/>
+          <w:szCs w:val="32"/>
+        </w:rPr>
         <w:t>EMU 验证工具链：硬件加速仿真平台  2024.06 - 2025.01</w:t>
       </w:r>
     </w:p>
@@ -874,6 +829,59 @@
           <w:sz w:val="20"/>
           <w:szCs w:val="32"/>
         </w:rPr>
+        <w:t>集创赛紫光杯：基于 FPGA 的视频缩放拼接目标识别工程  2023.03 - 2023.06</w:t>
+      </w:r>
+    </w:p>
+    <w:p>
+      <w:r>
+        <w:rPr>
+          <w:color w:val="000000"/>
+          <w:sz w:val="20"/>
+          <w:szCs w:val="32"/>
+        </w:rPr>
+        <w:t>▸ 基于紫光同创 PGL50H/MES50HP 平台完成多路视频采集、缩放、DDR3 缓存与 HDMI 回环显示，支持 OV5640/HDMI 输入链路。</w:t>
+      </w:r>
+    </w:p>
+    <w:p>
+      <w:r>
+        <w:rPr>
+          <w:color w:val="000000"/>
+          <w:sz w:val="20"/>
+          <w:szCs w:val="32"/>
+        </w:rPr>
+        <w:t>▸ 设计 DDR3 读写控制、乒乓缓存、视频拼接地址偏移与多路写入仲裁，完成四分屏视频流实时拼接。</w:t>
+      </w:r>
+    </w:p>
+    <w:p>
+      <w:r>
+        <w:rPr>
+          <w:color w:val="000000"/>
+          <w:sz w:val="20"/>
+          <w:szCs w:val="32"/>
+        </w:rPr>
+        <w:t>▸ 实现千兆以太网 UDP 图像传输、ARP/ICMP 基础网络链路和 PyQt5 上位机，接入 YOLOv5 目标检测与显示交互。</w:t>
+      </w:r>
+    </w:p>
+    <w:p>
+      <w:r>
+        <w:rPr>
+          <w:color w:val="000000"/>
+          <w:sz w:val="20"/>
+          <w:szCs w:val="32"/>
+        </w:rPr>
+        <w:t>▸ 完成竞赛设计文档、性能测试与上板验证：30Hz 画面无明显卡顿，UDP 发送约 130-140Mbps，识别帧率约 4-5 FPS。</w:t>
+      </w:r>
+    </w:p>
+    <w:p>
+      <w:pPr>
+        <w:pStyle w:val="9"/>
+      </w:pPr>
+      <w:r>
+        <w:rPr>
+          <w:color w:val="3498DB"/>
+          <w:sz w:val="20"/>
+          <w:szCs w:val="32"/>
+        </w:rPr>
         <w:t>一生一芯：基于 RISC-V64 指令集的单发射处理器设计与验证  2022.07 - 2023.10</w:t>
       </w:r>
     </w:p>
@@ -907,7 +915,6 @@
         <w:t>▸ 优化 LIBC 与图形绘制路径，将 RTL 仿真运行仙剑奇侠传的速度提升至 2 分钟内完成考核目标；演示视频：https://www.bilibili.com/video/BV1Sm411R7Am</w:t>
       </w:r>
     </w:p>
-    <w:p/>
     <w:p>
       <w:pPr>
         <w:pStyle w:val="7"/>

</xml_diff>

<commit_message>
docs: refine simulator resume content
Expand NEMU and gem5 simulator experience, lengthen the kimi45 RISC-V project timeline, and tone down AI-styled wording and visuals across the resume site and DOCX.
</commit_message>
<xml_diff>
--- a/assets/feng-kehan-resume.docx
+++ b/assets/feng-kehan-resume.docx
@@ -258,7 +258,7 @@
           <ns0:sz ns0:val="20"/>
           <ns0:szCs ns0:val="32"/>
         </ns0:rPr>
-        <ns0:t>• 负责处理器 ISA 级验证工具链建设，覆盖 Difftest、NEMU/QEMU、EMU/FPGA/Palladium、高速 PCIe 数据通路与自动化 CI。</ns0:t>
+        <ns0:t>• 负责处理器 ISA 级验证工具链建设，覆盖 Difftest、NEMU/gem5/QEMU、EMU/FPGA/Palladium、高速 PCIe 数据通路与自动化 CI。</ns0:t>
       </ns0:r>
     </ns0:p>
     <ns0:p ns2:paraId="34985F30">
@@ -268,7 +268,17 @@
           <ns0:sz ns0:val="20"/>
           <ns0:szCs ns0:val="32"/>
         </ns0:rPr>
-        <ns0:t>• 负责 NEMU/QEMU 参考模型与 Difftest 验证链路优化，支撑 FPGA/EMU 验证平台性能与稳定性提升。</ns0:t>
+        <ns0:t>• 负责 NEMU/gem5 相关模拟器开发与调试，补充 RISC-V 指令、CSR、异常路径和 Difftest 状态对齐能力，支撑 workload 复现与 trace 定位。</ns0:t>
+      </ns0:r>
+    </ns0:p>
+    <ns0:p ns2:paraId="34985F30">
+      <ns0:r>
+        <ns0:rPr>
+          <ns0:color ns0:val="000000"/>
+          <ns0:sz ns0:val="20"/>
+          <ns0:szCs ns0:val="32"/>
+        </ns0:rPr>
+        <ns0:t>• 优化 NEMU REF 模式热路径，通过 tcache、PMP/PMA 权限缓存与预解码、Host TLB 等改动提升 FPGA/EMU 验证吞吐。</ns0:t>
       </ns0:r>
     </ns0:p>
     <ns0:p ns2:paraId="104C2345">
@@ -321,7 +331,17 @@
           <ns0:sz ns0:val="20"/>
           <ns0:szCs ns0:val="32"/>
         </ns0:rPr>
-        <ns0:t>• 参与 NEMU/QEMU/GEM5 模拟器维护、RISC-V Vector 指令调试、Palladium Difftest 与 SPEC06 一键测试能力建设。</ns0:t>
+        <ns0:t>• 参与 NEMU/QEMU/gem5 模拟器维护，补充 RISC-V 指令、CSR 与异常处理路径，配合 Difftest 修正参考模型和 RTL 状态差异。</ns0:t>
+      </ns0:r>
+    </ns0:p>
+    <ns0:p ns2:paraId="00FB34EF">
+      <ns0:r>
+        <ns0:rPr>
+          <ns0:color ns0:val="000000"/>
+          <ns0:sz ns0:val="20"/>
+          <ns0:szCs ns0:val="32"/>
+        </ns0:rPr>
+        <ns0:t>• 调试 RISC-V Vector workload 与 SPEC06 用例，整理可复现实验脚本、trace 日志和最小化 case，支撑 Palladium Difftest 一键测试流程。</ns0:t>
       </ns0:r>
     </ns0:p>
     <ns0:p ns2:paraId="7B833DCC">
@@ -453,7 +473,7 @@
           <ns0:sz ns0:val="20"/>
           <ns0:szCs ns0:val="32"/>
         </ns0:rPr>
-        <ns0:t>RISC-V RandomX：随机访存哈希 workload 的多核 RISC-V SoC 探索  2026.05 - 至今</ns0:t>
+        <ns0:t>kimi45 RISC-V RandomX：随机访存哈希 workload 的多核 SoC 探索  2025.12 - 至今</ns0:t>
       </ns0:r>
     </ns0:p>
     <ns0:p ns2:paraId="625EF293">
@@ -463,7 +483,7 @@
           <ns0:sz ns0:val="20"/>
           <ns0:szCs ns0:val="32"/>
         </ns0:rPr>
-        <ns0:t>▸ 基于 kimi45 内核搭建面向随机访存与哈希计算的 RV64 SoC 验证平台，覆盖工作集建模、性能 profiling、DRAMSim3 内存时序与远端 Verilator 回归。</ns0:t>
+        <ns0:t>▸ 基于 kimi45 RV64 内核搭建面向随机访存与哈希计算的 SoC 验证平台，覆盖工作集建模、性能 profiling、DRAMSim3 内存时序与远端 Verilator 回归。</ns0:t>
       </ns0:r>
     </ns0:p>
     <ns0:p ns2:paraId="0881D4B5">
@@ -505,7 +525,7 @@
           <ns0:szCs ns0:val="32"/>
           <ns0:lang ns0:val="en-US" ns0:eastAsia="zh-CN"/>
         </ns0:rPr>
-        <ns0:t xml:space="preserve">soomrv </ns0:t>
+        <ns0:t>kimi45 / soomrv 45 内核：RV64 OoO Core Bring-up 与内存系统改造  2025.12 - 至今</ns0:t>
       </ns0:r>
       <ns0:r>
         <ns0:rPr>
@@ -513,7 +533,6 @@
           <ns0:sz ns0:val="20"/>
           <ns0:szCs ns0:val="32"/>
         </ns0:rPr>
-        <ns0:t>45 内核：RV64 OoO Core Bring-up 与内存系统改造  2026.05 - 至今</ns0:t>
       </ns0:r>
     </ns0:p>
     <ns0:p ns2:paraId="22A0421B">
@@ -584,7 +603,7 @@
           <ns0:sz ns0:val="20"/>
           <ns0:szCs ns0:val="32"/>
         </ns0:rPr>
-        <ns0:t>Celviz AI-Driven EDA：个人自研 Agent 芯片设计与验证工作台  2026.01 - 至今</ns0:t>
+        <ns0:t>Celviz 工程工具链：芯片设计与验证辅助平台  2026.01 - 至今</ns0:t>
       </ns0:r>
     </ns0:p>
     <ns0:p ns2:paraId="31D59DA7">
@@ -594,7 +613,7 @@
           <ns0:sz ns0:val="20"/>
           <ns0:szCs ns0:val="32"/>
         </ns0:rPr>
-        <ns0:t>▸ 个人独立设计并实现 Celviz Agent 工作台，支持本地/远程 Web、Tauri 桌面端、无 GUI Shell 三类入口，统一工作区、运行记录与结果包管理。</ns0:t>
+        <ns0:t>▸ 个人自研工程工具，提供本地/远程 Web、Tauri 桌面端和无 GUI Shell 入口，用于管理代码工作区、运行记录和结果包。</ns0:t>
       </ns0:r>
     </ns0:p>
     <ns0:p ns2:paraId="29705C23">
@@ -604,7 +623,7 @@
           <ns0:sz ns0:val="20"/>
           <ns0:szCs ns0:val="32"/>
         </ns0:rPr>
-        <ns0:t>▸ 构建面向 EDA 工程的 Skill/知识库/RAG 体系，沉淀架构文档、项目索引、查询模板与工程经验，支持 AI 基于代码上下文完成任务。</ns0:t>
+        <ns0:t>▸ 整理 EDA 项目知识库和检索索引，沉淀架构文档、项目索引、查询模板与常见调试经验。</ns0:t>
       </ns0:r>
     </ns0:p>
     <ns0:p ns2:paraId="5BB1916A">
@@ -614,7 +633,7 @@
           <ns0:sz ns0:val="20"/>
           <ns0:szCs ns0:val="32"/>
         </ns0:rPr>
-        <ns0:t>▸ 设计 EDA 工具链后端资产边界，将 aieda、parser、ieda、iflow、idata、source navigation 等模块纳入 services/oscc，形成可验证、可检索、可复用的工程资产。</ns0:t>
+        <ns0:t>▸ 按服务边界接入 aieda、parser、ieda、iflow、idata、source navigation 等模块，方便代码检索、流程调用和结果归档。</ns0:t>
       </ns0:r>
     </ns0:p>
     <ns0:p ns2:paraId="213DA2AD">
@@ -624,7 +643,7 @@
           <ns0:sz ns0:val="20"/>
           <ns0:szCs ns0:val="32"/>
         </ns0:rPr>
-        <ns0:t>▸ 建设 Agent 协作开发与验证闭环，覆盖需求拆解、代码生成、代码审查、测试运行、validation log、evidence bundle、risk extraction 与 readiness report。</ns0:t>
+        <ns0:t>▸ 沉淀常用开发流程，覆盖需求拆解、补丁生成、代码审查、测试运行、validation log、evidence bundle、risk extraction 与 readiness report。</ns0:t>
       </ns0:r>
     </ns0:p>
     <ns0:p ns2:paraId="142350CA">
@@ -634,7 +653,7 @@
           <ns0:sz ns0:val="20"/>
           <ns0:szCs ns0:val="32"/>
         </ns0:rPr>
-        <ns0:t>▸ 面向 AI 自动架构探索与 RTL 验证，打通 SPEC 文档生成、架构模拟器反馈、Difftest/仿真验证任务编排，为后续自动 RTL 实现提供工程基础。</ns0:t>
+        <ns0:t>▸ 面向架构探索与 RTL 验证，串起 SPEC 文档、模拟器反馈、Difftest/仿真任务编排，为后续自动 RTL 实现提供工程基础。</ns0:t>
       </ns0:r>
     </ns0:p>
     <ns0:p ns2:paraId="6CCBD0CB">
@@ -1002,15 +1021,14 @@
           <ns0:sz ns0:val="20"/>
           <ns0:szCs ns0:val="32"/>
         </ns0:rPr>
-        <ns0:t>模拟器：</ns0:t>
-      </ns0:r>
-      <ns0:r>
-        <ns0:rPr>
-          <ns0:color ns0:val="000000"/>
-          <ns0:sz ns0:val="20"/>
-          <ns0:szCs ns0:val="32"/>
-        </ns0:rPr>
-        <ns0:t>NEMU/QEMU/Spike/GEM5架构模拟器开发与优化</ns0:t>
+        <ns0:t>模拟器：NEMU/QEMU/Spike/gem5 架构模拟器开发、trace 调试与性能优化</ns0:t>
+      </ns0:r>
+      <ns0:r>
+        <ns0:rPr>
+          <ns0:color ns0:val="000000"/>
+          <ns0:sz ns0:val="20"/>
+          <ns0:szCs ns0:val="32"/>
+        </ns0:rPr>
       </ns0:r>
     </ns0:p>
     <ns0:p ns2:paraId="0FDB1774">
@@ -1056,15 +1074,14 @@
           <ns0:sz ns0:val="20"/>
           <ns0:szCs ns0:val="32"/>
         </ns0:rPr>
-        <ns0:t>EDA工具：</ns0:t>
-      </ns0:r>
-      <ns0:r>
-        <ns0:rPr>
-          <ns0:color ns0:val="000000"/>
-          <ns0:sz ns0:val="20"/>
-          <ns0:szCs ns0:val="32"/>
-        </ns0:rPr>
-        <ns0:t>Xilinx/国产FPGA开发、DRAMSim内存模拟、CI/CD</ns0:t>
+        <ns0:t>工程工具：Xilinx/国产FPGA开发、DRAMSim内存模拟、项目知识库、CI/CD</ns0:t>
+      </ns0:r>
+      <ns0:r>
+        <ns0:rPr>
+          <ns0:color ns0:val="000000"/>
+          <ns0:sz ns0:val="20"/>
+          <ns0:szCs ns0:val="32"/>
+        </ns0:rPr>
       </ns0:r>
     </ns0:p>
     <ns0:p ns2:paraId="271C67B8">

</xml_diff>